<commit_message>
Update README and documentation with team author info
</commit_message>
<xml_diff>
--- a/Filmtar_Dokumentacio.docx
+++ b/Filmtar_Dokumentacio.docx
@@ -106,7 +106,7 @@
           <w:color w:val="646464"/>
           <w:sz w:val="28"/>
         </w:rPr>
-        <w:t>Keszitette:</w:t>
+        <w:t>Keszitettek:</w:t>
       </w:r>
     </w:p>
     <w:p>
@@ -121,7 +121,52 @@
           <w:color w:val="1A1A2E"/>
           <w:sz w:val="36"/>
         </w:rPr>
-        <w:t>[Hallgato neve]</w:t>
+        <w:t>Gaál Péter</w:t>
+      </w:r>
+    </w:p>
+    <w:p>
+      <w:pPr>
+        <w:jc w:val="center"/>
+      </w:pPr>
+      <w:r>
+        <w:rPr>
+          <w:rFonts w:ascii="Times New Roman" w:hAnsi="Times New Roman" w:cs="Times New Roman"/>
+          <w:b w:val="0"/>
+          <w:i w:val="0"/>
+          <w:color w:val="646464"/>
+          <w:sz w:val="24"/>
+        </w:rPr>
+        <w:t>Neptun: GULX05</w:t>
+      </w:r>
+    </w:p>
+    <w:p>
+      <w:pPr>
+        <w:jc w:val="center"/>
+      </w:pPr>
+      <w:r>
+        <w:rPr>
+          <w:rFonts w:ascii="Times New Roman" w:hAnsi="Times New Roman" w:cs="Times New Roman"/>
+          <w:b/>
+          <w:i w:val="0"/>
+          <w:color w:val="1A1A2E"/>
+          <w:sz w:val="36"/>
+        </w:rPr>
+        <w:t>Molnár Ádám</w:t>
+      </w:r>
+    </w:p>
+    <w:p>
+      <w:pPr>
+        <w:jc w:val="center"/>
+      </w:pPr>
+      <w:r>
+        <w:rPr>
+          <w:rFonts w:ascii="Times New Roman" w:hAnsi="Times New Roman" w:cs="Times New Roman"/>
+          <w:b w:val="0"/>
+          <w:i w:val="0"/>
+          <w:color w:val="646464"/>
+          <w:sz w:val="24"/>
+        </w:rPr>
+        <w:t>Neptun: MFG82Z</w:t>
       </w:r>
     </w:p>
     <w:p/>

</xml_diff>